<commit_message>
Added map, updated pdf, fixed a place where I mentioned the database, and added the info logic map
</commit_message>
<xml_diff>
--- a/D2_DispatchNet/use_cases/use_cases_v0.2.docx
+++ b/D2_DispatchNet/use_cases/use_cases_v0.2.docx
@@ -43243,15 +43243,7 @@
             </w:pPr>
             <w:r>
               <w:rPr/>
-              <w:t>UC1</w:t>
-            </w:r>
-            <w:r>
-              <w:rPr/>
-              <w:t>5</w:t>
-            </w:r>
-            <w:r>
-              <w:rPr/>
-              <w:t>, v0.1, 28/04/2026</w:t>
+              <w:t>UC15, v0.1, 28/04/2026</w:t>
             </w:r>
           </w:p>
         </w:tc>
@@ -43367,11 +43359,7 @@
             </w:pPr>
             <w:r>
               <w:rPr/>
-              <w:t xml:space="preserve">Let any user </w:t>
-            </w:r>
-            <w:r>
-              <w:rPr/>
-              <w:t>find station by name</w:t>
+              <w:t>Let any user find station by name</w:t>
             </w:r>
           </w:p>
         </w:tc>
@@ -44411,7 +44399,7 @@
               <w:rPr>
                 <w:lang w:val="en-US"/>
               </w:rPr>
-              <w:t>The system matches that string agains all known names of stations in database</w:t>
+              <w:t xml:space="preserve">The system matches that string agains all known names of stations </w:t>
             </w:r>
           </w:p>
         </w:tc>
@@ -44835,6 +44823,18 @@
         </w:tc>
       </w:tr>
     </w:tbl>
+    <w:p>
+      <w:pPr>
+        <w:pStyle w:val="BodyText"/>
+        <w:rPr/>
+      </w:pPr>
+      <w:r>
+        <w:rPr/>
+      </w:r>
+      <w:r>
+        <w:br w:type="page"/>
+      </w:r>
+    </w:p>
     <w:tbl>
       <w:tblPr>
         <w:tblW w:w="9825" w:type="dxa"/>
@@ -44877,9 +44877,6 @@
               </w:rPr>
             </w:pPr>
             <w:r>
-              <w:br w:type="page"/>
-            </w:r>
-            <w:r>
               <w:rPr>
                 <w:b/>
                 <w:bCs/>
@@ -44970,15 +44967,7 @@
             </w:pPr>
             <w:r>
               <w:rPr/>
-              <w:t>UC1</w:t>
-            </w:r>
-            <w:r>
-              <w:rPr/>
-              <w:t>5</w:t>
-            </w:r>
-            <w:r>
-              <w:rPr/>
-              <w:t>, v0.1, 28/04/2026</w:t>
+              <w:t>UC15, v0.1, 28/04/2026</w:t>
             </w:r>
           </w:p>
         </w:tc>
@@ -45094,11 +45083,7 @@
             </w:pPr>
             <w:r>
               <w:rPr/>
-              <w:t xml:space="preserve">Let any user </w:t>
-            </w:r>
-            <w:r>
-              <w:rPr/>
-              <w:t>find a train service by ID</w:t>
+              <w:t>Let any user find a train service by ID</w:t>
             </w:r>
           </w:p>
         </w:tc>
@@ -46569,8 +46554,1508 @@
         <w:rPr/>
       </w:pPr>
       <w:r>
+        <w:rPr/>
+      </w:r>
+      <w:r>
         <w:br w:type="page"/>
       </w:r>
+    </w:p>
+    <w:tbl>
+      <w:tblPr>
+        <w:tblW w:w="9825" w:type="dxa"/>
+        <w:jc w:val="start"/>
+        <w:tblInd w:w="0" w:type="dxa"/>
+        <w:tblLayout w:type="fixed"/>
+        <w:tblCellMar>
+          <w:top w:w="0" w:type="dxa"/>
+          <w:start w:w="108" w:type="dxa"/>
+          <w:bottom w:w="0" w:type="dxa"/>
+          <w:end w:w="108" w:type="dxa"/>
+        </w:tblCellMar>
+        <w:tblLook w:val="04a0" w:noHBand="0" w:noVBand="1" w:firstColumn="1" w:lastRow="0" w:lastColumn="0" w:firstRow="1"/>
+      </w:tblPr>
+      <w:tblGrid>
+        <w:gridCol w:w="2627"/>
+        <w:gridCol w:w="1078"/>
+        <w:gridCol w:w="2521"/>
+        <w:gridCol w:w="3599"/>
+      </w:tblGrid>
+      <w:tr>
+        <w:trPr/>
+        <w:tc>
+          <w:tcPr>
+            <w:tcW w:w="2627" w:type="dxa"/>
+            <w:tcBorders>
+              <w:top w:val="single" w:sz="4" w:space="0" w:color="000000"/>
+              <w:start w:val="single" w:sz="4" w:space="0" w:color="000000"/>
+              <w:bottom w:val="single" w:sz="4" w:space="0" w:color="000000"/>
+              <w:end w:val="single" w:sz="4" w:space="0" w:color="000000"/>
+            </w:tcBorders>
+          </w:tcPr>
+          <w:p>
+            <w:pPr>
+              <w:pStyle w:val="Normal"/>
+              <w:pageBreakBefore/>
+              <w:spacing w:before="0" w:after="160"/>
+              <w:rPr>
+                <w:lang w:val="it-IT"/>
+              </w:rPr>
+            </w:pPr>
+            <w:r>
+              <w:rPr>
+                <w:b/>
+                <w:bCs/>
+                <w:lang w:val="it-IT"/>
+              </w:rPr>
+              <w:t xml:space="preserve">Use case </w:t>
+            </w:r>
+          </w:p>
+        </w:tc>
+        <w:tc>
+          <w:tcPr>
+            <w:tcW w:w="7198" w:type="dxa"/>
+            <w:gridSpan w:val="3"/>
+            <w:tcBorders>
+              <w:top w:val="single" w:sz="4" w:space="0" w:color="000000"/>
+              <w:start w:val="single" w:sz="4" w:space="0" w:color="000000"/>
+              <w:bottom w:val="single" w:sz="4" w:space="0" w:color="000000"/>
+              <w:end w:val="single" w:sz="4" w:space="0" w:color="000000"/>
+            </w:tcBorders>
+          </w:tcPr>
+          <w:p>
+            <w:pPr>
+              <w:pStyle w:val="Normal"/>
+              <w:spacing w:before="0" w:after="160"/>
+              <w:rPr>
+                <w:lang w:val="en-US"/>
+              </w:rPr>
+            </w:pPr>
+            <w:r>
+              <w:rPr>
+                <w:lang w:val="en-US"/>
+              </w:rPr>
+              <w:t>Show Map</w:t>
+            </w:r>
+          </w:p>
+        </w:tc>
+      </w:tr>
+      <w:tr>
+        <w:trPr/>
+        <w:tc>
+          <w:tcPr>
+            <w:tcW w:w="2627" w:type="dxa"/>
+            <w:tcBorders>
+              <w:top w:val="single" w:sz="4" w:space="0" w:color="000000"/>
+              <w:start w:val="single" w:sz="4" w:space="0" w:color="000000"/>
+              <w:bottom w:val="single" w:sz="4" w:space="0" w:color="000000"/>
+              <w:end w:val="single" w:sz="4" w:space="0" w:color="000000"/>
+            </w:tcBorders>
+          </w:tcPr>
+          <w:p>
+            <w:pPr>
+              <w:pStyle w:val="Normal"/>
+              <w:spacing w:before="0" w:after="160"/>
+              <w:rPr>
+                <w:b/>
+                <w:bCs/>
+                <w:lang w:val="it-IT"/>
+              </w:rPr>
+            </w:pPr>
+            <w:r>
+              <w:rPr>
+                <w:b/>
+                <w:bCs/>
+                <w:lang w:val="it-IT"/>
+              </w:rPr>
+              <w:t>Release (id)</w:t>
+            </w:r>
+          </w:p>
+        </w:tc>
+        <w:tc>
+          <w:tcPr>
+            <w:tcW w:w="7198" w:type="dxa"/>
+            <w:gridSpan w:val="3"/>
+            <w:tcBorders>
+              <w:top w:val="single" w:sz="4" w:space="0" w:color="000000"/>
+              <w:start w:val="single" w:sz="4" w:space="0" w:color="000000"/>
+              <w:bottom w:val="single" w:sz="4" w:space="0" w:color="000000"/>
+              <w:end w:val="single" w:sz="4" w:space="0" w:color="000000"/>
+            </w:tcBorders>
+          </w:tcPr>
+          <w:p>
+            <w:pPr>
+              <w:pStyle w:val="Normal"/>
+              <w:spacing w:before="0" w:after="160"/>
+              <w:rPr>
+                <w:lang w:val="it-IT"/>
+              </w:rPr>
+            </w:pPr>
+            <w:r>
+              <w:rPr/>
+              <w:t>UC1</w:t>
+            </w:r>
+            <w:r>
+              <w:rPr/>
+              <w:t>6</w:t>
+            </w:r>
+            <w:r>
+              <w:rPr/>
+              <w:t>, v0.1, 28/04/2026</w:t>
+            </w:r>
+          </w:p>
+        </w:tc>
+      </w:tr>
+      <w:tr>
+        <w:trPr/>
+        <w:tc>
+          <w:tcPr>
+            <w:tcW w:w="2627" w:type="dxa"/>
+            <w:tcBorders>
+              <w:top w:val="single" w:sz="4" w:space="0" w:color="000000"/>
+              <w:start w:val="single" w:sz="4" w:space="0" w:color="000000"/>
+              <w:bottom w:val="single" w:sz="4" w:space="0" w:color="000000"/>
+              <w:end w:val="single" w:sz="4" w:space="0" w:color="000000"/>
+            </w:tcBorders>
+          </w:tcPr>
+          <w:p>
+            <w:pPr>
+              <w:pStyle w:val="Normal"/>
+              <w:spacing w:before="0" w:after="160"/>
+              <w:rPr>
+                <w:b/>
+                <w:bCs/>
+                <w:lang w:val="it-IT"/>
+              </w:rPr>
+            </w:pPr>
+            <w:r>
+              <w:rPr>
+                <w:b/>
+                <w:bCs/>
+                <w:lang w:val="it-IT"/>
+              </w:rPr>
+              <w:t>Context of Use</w:t>
+            </w:r>
+          </w:p>
+        </w:tc>
+        <w:tc>
+          <w:tcPr>
+            <w:tcW w:w="7198" w:type="dxa"/>
+            <w:gridSpan w:val="3"/>
+            <w:tcBorders>
+              <w:top w:val="single" w:sz="4" w:space="0" w:color="000000"/>
+              <w:start w:val="single" w:sz="4" w:space="0" w:color="000000"/>
+              <w:bottom w:val="single" w:sz="4" w:space="0" w:color="000000"/>
+              <w:end w:val="single" w:sz="4" w:space="0" w:color="000000"/>
+            </w:tcBorders>
+          </w:tcPr>
+          <w:p>
+            <w:pPr>
+              <w:pStyle w:val="Normal"/>
+              <w:spacing w:before="0" w:after="160"/>
+              <w:rPr>
+                <w:lang w:val="en-US"/>
+              </w:rPr>
+            </w:pPr>
+            <w:r>
+              <w:rPr/>
+              <w:t>Info Display</w:t>
+            </w:r>
+          </w:p>
+        </w:tc>
+      </w:tr>
+      <w:tr>
+        <w:trPr/>
+        <w:tc>
+          <w:tcPr>
+            <w:tcW w:w="2627" w:type="dxa"/>
+            <w:tcBorders>
+              <w:top w:val="single" w:sz="4" w:space="0" w:color="000000"/>
+              <w:start w:val="single" w:sz="4" w:space="0" w:color="000000"/>
+              <w:bottom w:val="single" w:sz="4" w:space="0" w:color="000000"/>
+              <w:end w:val="single" w:sz="4" w:space="0" w:color="000000"/>
+            </w:tcBorders>
+          </w:tcPr>
+          <w:p>
+            <w:pPr>
+              <w:pStyle w:val="Normal"/>
+              <w:spacing w:before="0" w:after="160"/>
+              <w:rPr>
+                <w:b/>
+                <w:bCs/>
+                <w:lang w:val="it-IT"/>
+              </w:rPr>
+            </w:pPr>
+            <w:r>
+              <w:rPr>
+                <w:b/>
+                <w:bCs/>
+                <w:lang w:val="it-IT"/>
+              </w:rPr>
+              <w:t>Scope</w:t>
+            </w:r>
+          </w:p>
+        </w:tc>
+        <w:tc>
+          <w:tcPr>
+            <w:tcW w:w="7198" w:type="dxa"/>
+            <w:gridSpan w:val="3"/>
+            <w:tcBorders>
+              <w:top w:val="single" w:sz="4" w:space="0" w:color="000000"/>
+              <w:start w:val="single" w:sz="4" w:space="0" w:color="000000"/>
+              <w:bottom w:val="single" w:sz="4" w:space="0" w:color="000000"/>
+              <w:end w:val="single" w:sz="4" w:space="0" w:color="000000"/>
+            </w:tcBorders>
+          </w:tcPr>
+          <w:p>
+            <w:pPr>
+              <w:pStyle w:val="Normal"/>
+              <w:spacing w:before="0" w:after="160"/>
+              <w:rPr>
+                <w:lang w:val="en-US"/>
+              </w:rPr>
+            </w:pPr>
+            <w:r>
+              <w:rPr/>
+              <w:t xml:space="preserve">Let </w:t>
+            </w:r>
+            <w:r>
+              <w:rPr/>
+              <w:t>any user see the stations and their connections</w:t>
+            </w:r>
+          </w:p>
+        </w:tc>
+      </w:tr>
+      <w:tr>
+        <w:trPr/>
+        <w:tc>
+          <w:tcPr>
+            <w:tcW w:w="2627" w:type="dxa"/>
+            <w:tcBorders>
+              <w:top w:val="single" w:sz="4" w:space="0" w:color="000000"/>
+              <w:start w:val="single" w:sz="4" w:space="0" w:color="000000"/>
+              <w:bottom w:val="single" w:sz="4" w:space="0" w:color="000000"/>
+              <w:end w:val="single" w:sz="4" w:space="0" w:color="000000"/>
+            </w:tcBorders>
+          </w:tcPr>
+          <w:p>
+            <w:pPr>
+              <w:pStyle w:val="Normal"/>
+              <w:spacing w:before="0" w:after="160"/>
+              <w:rPr>
+                <w:b/>
+                <w:bCs/>
+                <w:lang w:val="it-IT"/>
+              </w:rPr>
+            </w:pPr>
+            <w:r>
+              <w:rPr>
+                <w:b/>
+                <w:bCs/>
+                <w:lang w:val="it-IT"/>
+              </w:rPr>
+              <w:t>Level</w:t>
+            </w:r>
+          </w:p>
+        </w:tc>
+        <w:tc>
+          <w:tcPr>
+            <w:tcW w:w="7198" w:type="dxa"/>
+            <w:gridSpan w:val="3"/>
+            <w:tcBorders>
+              <w:top w:val="single" w:sz="4" w:space="0" w:color="000000"/>
+              <w:start w:val="single" w:sz="4" w:space="0" w:color="000000"/>
+              <w:bottom w:val="single" w:sz="4" w:space="0" w:color="000000"/>
+              <w:end w:val="single" w:sz="4" w:space="0" w:color="000000"/>
+            </w:tcBorders>
+          </w:tcPr>
+          <w:p>
+            <w:pPr>
+              <w:pStyle w:val="Normal"/>
+              <w:spacing w:before="0" w:after="160"/>
+              <w:rPr>
+                <w:lang w:val="en-US"/>
+              </w:rPr>
+            </w:pPr>
+            <w:r>
+              <w:rPr/>
+              <w:t>Primary Task</w:t>
+            </w:r>
+          </w:p>
+        </w:tc>
+      </w:tr>
+      <w:tr>
+        <w:trPr/>
+        <w:tc>
+          <w:tcPr>
+            <w:tcW w:w="2627" w:type="dxa"/>
+            <w:tcBorders>
+              <w:top w:val="single" w:sz="4" w:space="0" w:color="000000"/>
+              <w:start w:val="single" w:sz="4" w:space="0" w:color="000000"/>
+              <w:bottom w:val="single" w:sz="4" w:space="0" w:color="000000"/>
+              <w:end w:val="single" w:sz="4" w:space="0" w:color="000000"/>
+            </w:tcBorders>
+          </w:tcPr>
+          <w:p>
+            <w:pPr>
+              <w:pStyle w:val="Normal"/>
+              <w:spacing w:before="0" w:after="160"/>
+              <w:rPr>
+                <w:b/>
+                <w:bCs/>
+                <w:lang w:val="it-IT"/>
+              </w:rPr>
+            </w:pPr>
+            <w:r>
+              <w:rPr>
+                <w:b/>
+                <w:bCs/>
+                <w:lang w:val="it-IT"/>
+              </w:rPr>
+              <w:t>Primary actor</w:t>
+            </w:r>
+          </w:p>
+        </w:tc>
+        <w:tc>
+          <w:tcPr>
+            <w:tcW w:w="7198" w:type="dxa"/>
+            <w:gridSpan w:val="3"/>
+            <w:tcBorders>
+              <w:top w:val="single" w:sz="4" w:space="0" w:color="000000"/>
+              <w:start w:val="single" w:sz="4" w:space="0" w:color="000000"/>
+              <w:bottom w:val="single" w:sz="4" w:space="0" w:color="000000"/>
+              <w:end w:val="single" w:sz="4" w:space="0" w:color="000000"/>
+            </w:tcBorders>
+          </w:tcPr>
+          <w:p>
+            <w:pPr>
+              <w:pStyle w:val="Normal"/>
+              <w:spacing w:before="0" w:after="160"/>
+              <w:rPr>
+                <w:lang w:val="en-US"/>
+              </w:rPr>
+            </w:pPr>
+            <w:r>
+              <w:rPr/>
+              <w:t>User</w:t>
+            </w:r>
+          </w:p>
+        </w:tc>
+      </w:tr>
+      <w:tr>
+        <w:trPr>
+          <w:cantSplit w:val="true"/>
+        </w:trPr>
+        <w:tc>
+          <w:tcPr>
+            <w:tcW w:w="2627" w:type="dxa"/>
+            <w:vMerge w:val="restart"/>
+            <w:tcBorders>
+              <w:top w:val="single" w:sz="4" w:space="0" w:color="000000"/>
+              <w:start w:val="single" w:sz="4" w:space="0" w:color="000000"/>
+              <w:end w:val="single" w:sz="4" w:space="0" w:color="000000"/>
+            </w:tcBorders>
+          </w:tcPr>
+          <w:p>
+            <w:pPr>
+              <w:pStyle w:val="Normal"/>
+              <w:spacing w:before="0" w:after="160"/>
+              <w:rPr>
+                <w:b/>
+                <w:bCs/>
+                <w:lang w:val="it-IT"/>
+              </w:rPr>
+            </w:pPr>
+            <w:r>
+              <w:rPr>
+                <w:b/>
+                <w:bCs/>
+                <w:lang w:val="it-IT"/>
+              </w:rPr>
+              <w:t>Stakeholder &amp; interest</w:t>
+            </w:r>
+          </w:p>
+        </w:tc>
+        <w:tc>
+          <w:tcPr>
+            <w:tcW w:w="3599" w:type="dxa"/>
+            <w:gridSpan w:val="2"/>
+            <w:tcBorders>
+              <w:top w:val="single" w:sz="4" w:space="0" w:color="000000"/>
+              <w:start w:val="single" w:sz="4" w:space="0" w:color="000000"/>
+              <w:bottom w:val="single" w:sz="4" w:space="0" w:color="000000"/>
+              <w:end w:val="single" w:sz="4" w:space="0" w:color="000000"/>
+            </w:tcBorders>
+          </w:tcPr>
+          <w:p>
+            <w:pPr>
+              <w:pStyle w:val="Normal"/>
+              <w:spacing w:before="0" w:after="160"/>
+              <w:rPr>
+                <w:b/>
+                <w:bCs/>
+                <w:lang w:val="en-US"/>
+              </w:rPr>
+            </w:pPr>
+            <w:r>
+              <w:rPr>
+                <w:b/>
+                <w:bCs/>
+                <w:lang w:val="en-US"/>
+              </w:rPr>
+              <w:t>Stakeholder</w:t>
+            </w:r>
+          </w:p>
+        </w:tc>
+        <w:tc>
+          <w:tcPr>
+            <w:tcW w:w="3599" w:type="dxa"/>
+            <w:tcBorders>
+              <w:top w:val="single" w:sz="4" w:space="0" w:color="000000"/>
+              <w:start w:val="single" w:sz="4" w:space="0" w:color="000000"/>
+              <w:bottom w:val="single" w:sz="4" w:space="0" w:color="000000"/>
+              <w:end w:val="single" w:sz="4" w:space="0" w:color="000000"/>
+            </w:tcBorders>
+          </w:tcPr>
+          <w:p>
+            <w:pPr>
+              <w:pStyle w:val="Normal"/>
+              <w:spacing w:before="0" w:after="160"/>
+              <w:rPr>
+                <w:b/>
+                <w:bCs/>
+                <w:lang w:val="it-IT"/>
+              </w:rPr>
+            </w:pPr>
+            <w:r>
+              <w:rPr>
+                <w:b/>
+                <w:bCs/>
+                <w:lang w:val="it-IT"/>
+              </w:rPr>
+              <w:t>Interest</w:t>
+            </w:r>
+          </w:p>
+        </w:tc>
+      </w:tr>
+      <w:tr>
+        <w:trPr>
+          <w:cantSplit w:val="true"/>
+        </w:trPr>
+        <w:tc>
+          <w:tcPr>
+            <w:tcW w:w="2627" w:type="dxa"/>
+            <w:vMerge w:val="continue"/>
+            <w:tcBorders>
+              <w:start w:val="single" w:sz="4" w:space="0" w:color="000000"/>
+              <w:end w:val="single" w:sz="4" w:space="0" w:color="000000"/>
+            </w:tcBorders>
+          </w:tcPr>
+          <w:p>
+            <w:pPr>
+              <w:pStyle w:val="Normal"/>
+              <w:spacing w:before="0" w:after="160"/>
+              <w:rPr>
+                <w:b/>
+                <w:bCs/>
+                <w:lang w:val="it-IT"/>
+              </w:rPr>
+            </w:pPr>
+            <w:r>
+              <w:rPr>
+                <w:b/>
+                <w:bCs/>
+                <w:lang w:val="it-IT"/>
+              </w:rPr>
+            </w:r>
+          </w:p>
+        </w:tc>
+        <w:tc>
+          <w:tcPr>
+            <w:tcW w:w="3599" w:type="dxa"/>
+            <w:gridSpan w:val="2"/>
+            <w:tcBorders>
+              <w:top w:val="single" w:sz="4" w:space="0" w:color="000000"/>
+              <w:start w:val="single" w:sz="4" w:space="0" w:color="000000"/>
+              <w:bottom w:val="single" w:sz="4" w:space="0" w:color="000000"/>
+              <w:end w:val="single" w:sz="4" w:space="0" w:color="000000"/>
+            </w:tcBorders>
+          </w:tcPr>
+          <w:p>
+            <w:pPr>
+              <w:pStyle w:val="Normal"/>
+              <w:spacing w:before="0" w:after="160"/>
+              <w:rPr>
+                <w:lang w:val="it-IT"/>
+              </w:rPr>
+            </w:pPr>
+            <w:r>
+              <w:rPr/>
+              <w:t>User</w:t>
+            </w:r>
+          </w:p>
+        </w:tc>
+        <w:tc>
+          <w:tcPr>
+            <w:tcW w:w="3599" w:type="dxa"/>
+            <w:tcBorders>
+              <w:top w:val="single" w:sz="4" w:space="0" w:color="000000"/>
+              <w:start w:val="single" w:sz="4" w:space="0" w:color="000000"/>
+              <w:bottom w:val="single" w:sz="4" w:space="0" w:color="000000"/>
+              <w:end w:val="single" w:sz="4" w:space="0" w:color="000000"/>
+            </w:tcBorders>
+          </w:tcPr>
+          <w:p>
+            <w:pPr>
+              <w:pStyle w:val="Normal"/>
+              <w:spacing w:before="0" w:after="160"/>
+              <w:rPr>
+                <w:lang w:val="en-US"/>
+              </w:rPr>
+            </w:pPr>
+            <w:r>
+              <w:rPr/>
+              <w:t>See topology</w:t>
+            </w:r>
+          </w:p>
+        </w:tc>
+      </w:tr>
+      <w:tr>
+        <w:trPr>
+          <w:cantSplit w:val="true"/>
+        </w:trPr>
+        <w:tc>
+          <w:tcPr>
+            <w:tcW w:w="2627" w:type="dxa"/>
+            <w:tcBorders>
+              <w:start w:val="single" w:sz="4" w:space="0" w:color="000000"/>
+              <w:end w:val="single" w:sz="4" w:space="0" w:color="000000"/>
+            </w:tcBorders>
+          </w:tcPr>
+          <w:p>
+            <w:pPr>
+              <w:pStyle w:val="Normal"/>
+              <w:spacing w:before="0" w:after="160"/>
+              <w:rPr>
+                <w:b/>
+                <w:bCs/>
+                <w:lang w:val="en-US"/>
+              </w:rPr>
+            </w:pPr>
+            <w:r>
+              <w:rPr>
+                <w:b/>
+                <w:bCs/>
+                <w:lang w:val="en-US"/>
+              </w:rPr>
+            </w:r>
+          </w:p>
+        </w:tc>
+        <w:tc>
+          <w:tcPr>
+            <w:tcW w:w="3599" w:type="dxa"/>
+            <w:gridSpan w:val="2"/>
+            <w:tcBorders>
+              <w:top w:val="single" w:sz="4" w:space="0" w:color="000000"/>
+              <w:start w:val="single" w:sz="4" w:space="0" w:color="000000"/>
+              <w:bottom w:val="single" w:sz="4" w:space="0" w:color="000000"/>
+              <w:end w:val="single" w:sz="4" w:space="0" w:color="000000"/>
+            </w:tcBorders>
+          </w:tcPr>
+          <w:p>
+            <w:pPr>
+              <w:pStyle w:val="Normal"/>
+              <w:spacing w:before="0" w:after="160"/>
+              <w:rPr/>
+            </w:pPr>
+            <w:r>
+              <w:rPr/>
+              <w:t>System</w:t>
+            </w:r>
+          </w:p>
+        </w:tc>
+        <w:tc>
+          <w:tcPr>
+            <w:tcW w:w="3599" w:type="dxa"/>
+            <w:tcBorders>
+              <w:top w:val="single" w:sz="4" w:space="0" w:color="000000"/>
+              <w:start w:val="single" w:sz="4" w:space="0" w:color="000000"/>
+              <w:bottom w:val="single" w:sz="4" w:space="0" w:color="000000"/>
+              <w:end w:val="single" w:sz="4" w:space="0" w:color="000000"/>
+            </w:tcBorders>
+          </w:tcPr>
+          <w:p>
+            <w:pPr>
+              <w:pStyle w:val="Normal"/>
+              <w:spacing w:before="0" w:after="160"/>
+              <w:rPr/>
+            </w:pPr>
+            <w:r>
+              <w:rPr/>
+              <w:t>Manage the user interface, the database and their interactions</w:t>
+            </w:r>
+          </w:p>
+        </w:tc>
+      </w:tr>
+      <w:tr>
+        <w:trPr/>
+        <w:tc>
+          <w:tcPr>
+            <w:tcW w:w="2627" w:type="dxa"/>
+            <w:tcBorders>
+              <w:top w:val="single" w:sz="4" w:space="0" w:color="000000"/>
+              <w:start w:val="single" w:sz="4" w:space="0" w:color="000000"/>
+              <w:bottom w:val="single" w:sz="4" w:space="0" w:color="000000"/>
+              <w:end w:val="single" w:sz="4" w:space="0" w:color="000000"/>
+            </w:tcBorders>
+          </w:tcPr>
+          <w:p>
+            <w:pPr>
+              <w:pStyle w:val="Normal"/>
+              <w:spacing w:before="0" w:after="160"/>
+              <w:rPr>
+                <w:b/>
+                <w:bCs/>
+                <w:lang w:val="it-IT"/>
+              </w:rPr>
+            </w:pPr>
+            <w:r>
+              <w:rPr>
+                <w:b/>
+                <w:bCs/>
+                <w:lang w:val="it-IT"/>
+              </w:rPr>
+              <w:t>Preconditions</w:t>
+            </w:r>
+          </w:p>
+        </w:tc>
+        <w:tc>
+          <w:tcPr>
+            <w:tcW w:w="7198" w:type="dxa"/>
+            <w:gridSpan w:val="3"/>
+            <w:tcBorders>
+              <w:top w:val="single" w:sz="4" w:space="0" w:color="000000"/>
+              <w:start w:val="single" w:sz="4" w:space="0" w:color="000000"/>
+              <w:bottom w:val="single" w:sz="4" w:space="0" w:color="000000"/>
+              <w:end w:val="single" w:sz="4" w:space="0" w:color="000000"/>
+            </w:tcBorders>
+          </w:tcPr>
+          <w:p>
+            <w:pPr>
+              <w:pStyle w:val="Normal"/>
+              <w:spacing w:before="0" w:after="160"/>
+              <w:rPr>
+                <w:lang w:val="en-US"/>
+              </w:rPr>
+            </w:pPr>
+            <w:r>
+              <w:rPr/>
+              <w:t>None</w:t>
+            </w:r>
+          </w:p>
+        </w:tc>
+      </w:tr>
+      <w:tr>
+        <w:trPr/>
+        <w:tc>
+          <w:tcPr>
+            <w:tcW w:w="2627" w:type="dxa"/>
+            <w:tcBorders>
+              <w:top w:val="single" w:sz="4" w:space="0" w:color="000000"/>
+              <w:start w:val="single" w:sz="4" w:space="0" w:color="000000"/>
+              <w:bottom w:val="single" w:sz="4" w:space="0" w:color="000000"/>
+              <w:end w:val="single" w:sz="4" w:space="0" w:color="000000"/>
+            </w:tcBorders>
+          </w:tcPr>
+          <w:p>
+            <w:pPr>
+              <w:pStyle w:val="Normal"/>
+              <w:spacing w:before="0" w:after="160"/>
+              <w:rPr>
+                <w:b/>
+                <w:bCs/>
+                <w:lang w:val="it-IT"/>
+              </w:rPr>
+            </w:pPr>
+            <w:r>
+              <w:rPr>
+                <w:b/>
+                <w:bCs/>
+                <w:lang w:val="it-IT"/>
+              </w:rPr>
+              <w:t>Minimal Guarantees</w:t>
+            </w:r>
+          </w:p>
+        </w:tc>
+        <w:tc>
+          <w:tcPr>
+            <w:tcW w:w="7198" w:type="dxa"/>
+            <w:gridSpan w:val="3"/>
+            <w:tcBorders>
+              <w:top w:val="single" w:sz="4" w:space="0" w:color="000000"/>
+              <w:start w:val="single" w:sz="4" w:space="0" w:color="000000"/>
+              <w:bottom w:val="single" w:sz="4" w:space="0" w:color="000000"/>
+              <w:end w:val="single" w:sz="4" w:space="0" w:color="000000"/>
+            </w:tcBorders>
+          </w:tcPr>
+          <w:p>
+            <w:pPr>
+              <w:pStyle w:val="Normal"/>
+              <w:spacing w:before="0" w:after="160"/>
+              <w:rPr>
+                <w:lang w:val="en-US"/>
+              </w:rPr>
+            </w:pPr>
+            <w:r>
+              <w:rPr/>
+              <w:t>None</w:t>
+            </w:r>
+          </w:p>
+        </w:tc>
+      </w:tr>
+      <w:tr>
+        <w:trPr/>
+        <w:tc>
+          <w:tcPr>
+            <w:tcW w:w="2627" w:type="dxa"/>
+            <w:tcBorders>
+              <w:top w:val="single" w:sz="4" w:space="0" w:color="000000"/>
+              <w:start w:val="single" w:sz="4" w:space="0" w:color="000000"/>
+              <w:bottom w:val="single" w:sz="4" w:space="0" w:color="000000"/>
+              <w:end w:val="single" w:sz="4" w:space="0" w:color="000000"/>
+            </w:tcBorders>
+          </w:tcPr>
+          <w:p>
+            <w:pPr>
+              <w:pStyle w:val="Normal"/>
+              <w:spacing w:before="0" w:after="160"/>
+              <w:rPr>
+                <w:b/>
+                <w:bCs/>
+                <w:lang w:val="it-IT"/>
+              </w:rPr>
+            </w:pPr>
+            <w:r>
+              <w:rPr>
+                <w:b/>
+                <w:bCs/>
+                <w:lang w:val="it-IT"/>
+              </w:rPr>
+              <w:t>Success Guarantees</w:t>
+            </w:r>
+          </w:p>
+        </w:tc>
+        <w:tc>
+          <w:tcPr>
+            <w:tcW w:w="7198" w:type="dxa"/>
+            <w:gridSpan w:val="3"/>
+            <w:tcBorders>
+              <w:top w:val="single" w:sz="4" w:space="0" w:color="000000"/>
+              <w:start w:val="single" w:sz="4" w:space="0" w:color="000000"/>
+              <w:bottom w:val="single" w:sz="4" w:space="0" w:color="000000"/>
+              <w:end w:val="single" w:sz="4" w:space="0" w:color="000000"/>
+            </w:tcBorders>
+          </w:tcPr>
+          <w:p>
+            <w:pPr>
+              <w:pStyle w:val="Normal"/>
+              <w:spacing w:before="0" w:after="160"/>
+              <w:rPr>
+                <w:lang w:val="en-US"/>
+              </w:rPr>
+            </w:pPr>
+            <w:r>
+              <w:rPr/>
+              <w:t xml:space="preserve">The User is </w:t>
+            </w:r>
+            <w:r>
+              <w:rPr/>
+              <w:t>able to see stations distributed according to the topology of the network, and select one to expand into UC13</w:t>
+            </w:r>
+          </w:p>
+        </w:tc>
+      </w:tr>
+      <w:tr>
+        <w:trPr/>
+        <w:tc>
+          <w:tcPr>
+            <w:tcW w:w="2627" w:type="dxa"/>
+            <w:tcBorders>
+              <w:top w:val="single" w:sz="4" w:space="0" w:color="000000"/>
+              <w:start w:val="single" w:sz="4" w:space="0" w:color="000000"/>
+              <w:bottom w:val="single" w:sz="4" w:space="0" w:color="000000"/>
+              <w:end w:val="single" w:sz="4" w:space="0" w:color="000000"/>
+            </w:tcBorders>
+          </w:tcPr>
+          <w:p>
+            <w:pPr>
+              <w:pStyle w:val="Normal"/>
+              <w:spacing w:before="0" w:after="160"/>
+              <w:rPr>
+                <w:b/>
+                <w:bCs/>
+                <w:lang w:val="it-IT"/>
+              </w:rPr>
+            </w:pPr>
+            <w:r>
+              <w:rPr>
+                <w:b/>
+                <w:bCs/>
+                <w:lang w:val="it-IT"/>
+              </w:rPr>
+              <w:t>Trigger</w:t>
+            </w:r>
+          </w:p>
+        </w:tc>
+        <w:tc>
+          <w:tcPr>
+            <w:tcW w:w="7198" w:type="dxa"/>
+            <w:gridSpan w:val="3"/>
+            <w:tcBorders>
+              <w:top w:val="single" w:sz="4" w:space="0" w:color="000000"/>
+              <w:start w:val="single" w:sz="4" w:space="0" w:color="000000"/>
+              <w:bottom w:val="single" w:sz="4" w:space="0" w:color="000000"/>
+              <w:end w:val="single" w:sz="4" w:space="0" w:color="000000"/>
+            </w:tcBorders>
+          </w:tcPr>
+          <w:p>
+            <w:pPr>
+              <w:pStyle w:val="Normal"/>
+              <w:spacing w:before="0" w:after="160"/>
+              <w:rPr>
+                <w:lang w:val="en-US"/>
+              </w:rPr>
+            </w:pPr>
+            <w:r>
+              <w:rPr/>
+              <w:t>User selects “</w:t>
+            </w:r>
+            <w:r>
+              <w:rPr/>
+              <w:t>Show Map</w:t>
+            </w:r>
+            <w:r>
+              <w:rPr/>
+              <w:t>”</w:t>
+            </w:r>
+          </w:p>
+        </w:tc>
+      </w:tr>
+      <w:tr>
+        <w:trPr>
+          <w:cantSplit w:val="true"/>
+        </w:trPr>
+        <w:tc>
+          <w:tcPr>
+            <w:tcW w:w="2627" w:type="dxa"/>
+            <w:vMerge w:val="restart"/>
+            <w:tcBorders>
+              <w:top w:val="single" w:sz="4" w:space="0" w:color="000000"/>
+              <w:start w:val="single" w:sz="4" w:space="0" w:color="000000"/>
+              <w:bottom w:val="single" w:sz="4" w:space="0" w:color="000000"/>
+              <w:end w:val="single" w:sz="4" w:space="0" w:color="000000"/>
+            </w:tcBorders>
+          </w:tcPr>
+          <w:p>
+            <w:pPr>
+              <w:pStyle w:val="Normal"/>
+              <w:spacing w:before="0" w:after="160"/>
+              <w:rPr>
+                <w:b/>
+                <w:bCs/>
+                <w:lang w:val="it-IT"/>
+              </w:rPr>
+            </w:pPr>
+            <w:r>
+              <w:rPr>
+                <w:b/>
+                <w:bCs/>
+                <w:lang w:val="it-IT"/>
+              </w:rPr>
+              <w:t>Description</w:t>
+            </w:r>
+          </w:p>
+        </w:tc>
+        <w:tc>
+          <w:tcPr>
+            <w:tcW w:w="1078" w:type="dxa"/>
+            <w:tcBorders>
+              <w:top w:val="single" w:sz="4" w:space="0" w:color="000000"/>
+              <w:start w:val="single" w:sz="4" w:space="0" w:color="000000"/>
+              <w:bottom w:val="single" w:sz="4" w:space="0" w:color="000000"/>
+              <w:end w:val="single" w:sz="4" w:space="0" w:color="000000"/>
+            </w:tcBorders>
+          </w:tcPr>
+          <w:p>
+            <w:pPr>
+              <w:pStyle w:val="Normal"/>
+              <w:spacing w:before="0" w:after="160"/>
+              <w:rPr>
+                <w:b/>
+                <w:bCs/>
+                <w:lang w:val="en-US"/>
+              </w:rPr>
+            </w:pPr>
+            <w:r>
+              <w:rPr>
+                <w:b/>
+                <w:bCs/>
+                <w:lang w:val="en-US"/>
+              </w:rPr>
+              <w:t>Step</w:t>
+            </w:r>
+          </w:p>
+        </w:tc>
+        <w:tc>
+          <w:tcPr>
+            <w:tcW w:w="6120" w:type="dxa"/>
+            <w:gridSpan w:val="2"/>
+            <w:tcBorders>
+              <w:top w:val="single" w:sz="4" w:space="0" w:color="000000"/>
+              <w:start w:val="single" w:sz="4" w:space="0" w:color="000000"/>
+              <w:bottom w:val="single" w:sz="4" w:space="0" w:color="000000"/>
+              <w:end w:val="single" w:sz="4" w:space="0" w:color="000000"/>
+            </w:tcBorders>
+          </w:tcPr>
+          <w:p>
+            <w:pPr>
+              <w:pStyle w:val="Normal"/>
+              <w:spacing w:before="0" w:after="160"/>
+              <w:rPr>
+                <w:b/>
+                <w:bCs/>
+                <w:lang w:val="en-US"/>
+              </w:rPr>
+            </w:pPr>
+            <w:r>
+              <w:rPr>
+                <w:b/>
+                <w:bCs/>
+                <w:lang w:val="en-US"/>
+              </w:rPr>
+              <w:t>Action</w:t>
+            </w:r>
+          </w:p>
+        </w:tc>
+      </w:tr>
+      <w:tr>
+        <w:trPr>
+          <w:cantSplit w:val="true"/>
+        </w:trPr>
+        <w:tc>
+          <w:tcPr>
+            <w:tcW w:w="2627" w:type="dxa"/>
+            <w:vMerge w:val="continue"/>
+            <w:tcBorders>
+              <w:top w:val="single" w:sz="4" w:space="0" w:color="000000"/>
+              <w:start w:val="single" w:sz="4" w:space="0" w:color="000000"/>
+              <w:bottom w:val="single" w:sz="4" w:space="0" w:color="000000"/>
+              <w:end w:val="single" w:sz="4" w:space="0" w:color="000000"/>
+            </w:tcBorders>
+          </w:tcPr>
+          <w:p>
+            <w:pPr>
+              <w:pStyle w:val="Normal"/>
+              <w:spacing w:before="0" w:after="160"/>
+              <w:rPr>
+                <w:b/>
+                <w:bCs/>
+                <w:lang w:val="it-IT"/>
+              </w:rPr>
+            </w:pPr>
+            <w:r>
+              <w:rPr>
+                <w:b/>
+                <w:bCs/>
+                <w:lang w:val="it-IT"/>
+              </w:rPr>
+            </w:r>
+          </w:p>
+        </w:tc>
+        <w:tc>
+          <w:tcPr>
+            <w:tcW w:w="1078" w:type="dxa"/>
+            <w:tcBorders>
+              <w:top w:val="single" w:sz="4" w:space="0" w:color="000000"/>
+              <w:start w:val="single" w:sz="4" w:space="0" w:color="000000"/>
+              <w:bottom w:val="single" w:sz="4" w:space="0" w:color="000000"/>
+              <w:end w:val="single" w:sz="4" w:space="0" w:color="000000"/>
+            </w:tcBorders>
+          </w:tcPr>
+          <w:p>
+            <w:pPr>
+              <w:pStyle w:val="Normal"/>
+              <w:spacing w:before="0" w:after="160"/>
+              <w:rPr>
+                <w:lang w:val="it-IT"/>
+              </w:rPr>
+            </w:pPr>
+            <w:r>
+              <w:rPr/>
+              <w:t>1</w:t>
+            </w:r>
+          </w:p>
+        </w:tc>
+        <w:tc>
+          <w:tcPr>
+            <w:tcW w:w="6120" w:type="dxa"/>
+            <w:gridSpan w:val="2"/>
+            <w:tcBorders>
+              <w:top w:val="single" w:sz="4" w:space="0" w:color="000000"/>
+              <w:start w:val="single" w:sz="4" w:space="0" w:color="000000"/>
+              <w:bottom w:val="single" w:sz="4" w:space="0" w:color="000000"/>
+              <w:end w:val="single" w:sz="4" w:space="0" w:color="000000"/>
+            </w:tcBorders>
+          </w:tcPr>
+          <w:p>
+            <w:pPr>
+              <w:pStyle w:val="Normal"/>
+              <w:spacing w:before="0" w:after="160"/>
+              <w:rPr>
+                <w:lang w:val="en-US"/>
+              </w:rPr>
+            </w:pPr>
+            <w:r>
+              <w:rPr/>
+              <w:t>The user selects “</w:t>
+            </w:r>
+            <w:r>
+              <w:rPr/>
+              <w:t>Show Map</w:t>
+            </w:r>
+            <w:r>
+              <w:rPr/>
+              <w:t>”</w:t>
+            </w:r>
+          </w:p>
+        </w:tc>
+      </w:tr>
+      <w:tr>
+        <w:trPr>
+          <w:cantSplit w:val="true"/>
+        </w:trPr>
+        <w:tc>
+          <w:tcPr>
+            <w:tcW w:w="2627" w:type="dxa"/>
+            <w:vMerge w:val="continue"/>
+            <w:tcBorders>
+              <w:top w:val="single" w:sz="4" w:space="0" w:color="000000"/>
+              <w:start w:val="single" w:sz="4" w:space="0" w:color="000000"/>
+              <w:bottom w:val="single" w:sz="4" w:space="0" w:color="000000"/>
+              <w:end w:val="single" w:sz="4" w:space="0" w:color="000000"/>
+            </w:tcBorders>
+          </w:tcPr>
+          <w:p>
+            <w:pPr>
+              <w:pStyle w:val="Normal"/>
+              <w:spacing w:before="0" w:after="160"/>
+              <w:rPr>
+                <w:b/>
+                <w:bCs/>
+                <w:lang w:val="en-US"/>
+              </w:rPr>
+            </w:pPr>
+            <w:r>
+              <w:rPr>
+                <w:b/>
+                <w:bCs/>
+                <w:lang w:val="en-US"/>
+              </w:rPr>
+            </w:r>
+          </w:p>
+        </w:tc>
+        <w:tc>
+          <w:tcPr>
+            <w:tcW w:w="1078" w:type="dxa"/>
+            <w:tcBorders>
+              <w:top w:val="single" w:sz="4" w:space="0" w:color="000000"/>
+              <w:start w:val="single" w:sz="4" w:space="0" w:color="000000"/>
+              <w:bottom w:val="single" w:sz="4" w:space="0" w:color="000000"/>
+              <w:end w:val="single" w:sz="4" w:space="0" w:color="000000"/>
+            </w:tcBorders>
+          </w:tcPr>
+          <w:p>
+            <w:pPr>
+              <w:pStyle w:val="Normal"/>
+              <w:spacing w:before="0" w:after="160"/>
+              <w:rPr>
+                <w:lang w:val="it-IT"/>
+              </w:rPr>
+            </w:pPr>
+            <w:r>
+              <w:rPr/>
+              <w:t>2</w:t>
+            </w:r>
+          </w:p>
+        </w:tc>
+        <w:tc>
+          <w:tcPr>
+            <w:tcW w:w="6120" w:type="dxa"/>
+            <w:gridSpan w:val="2"/>
+            <w:tcBorders>
+              <w:top w:val="single" w:sz="4" w:space="0" w:color="000000"/>
+              <w:start w:val="single" w:sz="4" w:space="0" w:color="000000"/>
+              <w:bottom w:val="single" w:sz="4" w:space="0" w:color="000000"/>
+              <w:end w:val="single" w:sz="4" w:space="0" w:color="000000"/>
+            </w:tcBorders>
+          </w:tcPr>
+          <w:p>
+            <w:pPr>
+              <w:pStyle w:val="Normal"/>
+              <w:spacing w:before="0" w:after="160"/>
+              <w:rPr>
+                <w:lang w:val="en-US"/>
+              </w:rPr>
+            </w:pPr>
+            <w:r>
+              <w:rPr/>
+              <w:t xml:space="preserve">The system </w:t>
+            </w:r>
+            <w:r>
+              <w:rPr/>
+              <w:t>displays the topological map</w:t>
+            </w:r>
+          </w:p>
+        </w:tc>
+      </w:tr>
+      <w:tr>
+        <w:trPr>
+          <w:cantSplit w:val="true"/>
+        </w:trPr>
+        <w:tc>
+          <w:tcPr>
+            <w:tcW w:w="2627" w:type="dxa"/>
+            <w:vMerge w:val="continue"/>
+            <w:tcBorders>
+              <w:top w:val="single" w:sz="4" w:space="0" w:color="000000"/>
+              <w:start w:val="single" w:sz="4" w:space="0" w:color="000000"/>
+              <w:bottom w:val="single" w:sz="4" w:space="0" w:color="000000"/>
+              <w:end w:val="single" w:sz="4" w:space="0" w:color="000000"/>
+            </w:tcBorders>
+          </w:tcPr>
+          <w:p>
+            <w:pPr>
+              <w:pStyle w:val="Normal"/>
+              <w:spacing w:before="0" w:after="160"/>
+              <w:rPr>
+                <w:b/>
+                <w:bCs/>
+                <w:lang w:val="en-US"/>
+              </w:rPr>
+            </w:pPr>
+            <w:r>
+              <w:rPr>
+                <w:b/>
+                <w:bCs/>
+                <w:lang w:val="en-US"/>
+              </w:rPr>
+            </w:r>
+          </w:p>
+        </w:tc>
+        <w:tc>
+          <w:tcPr>
+            <w:tcW w:w="1078" w:type="dxa"/>
+            <w:tcBorders>
+              <w:start w:val="single" w:sz="4" w:space="0" w:color="000000"/>
+              <w:bottom w:val="single" w:sz="4" w:space="0" w:color="000000"/>
+              <w:end w:val="single" w:sz="4" w:space="0" w:color="000000"/>
+            </w:tcBorders>
+          </w:tcPr>
+          <w:p>
+            <w:pPr>
+              <w:pStyle w:val="Normal"/>
+              <w:spacing w:before="0" w:after="160"/>
+              <w:rPr>
+                <w:lang w:val="it-IT"/>
+              </w:rPr>
+            </w:pPr>
+            <w:r>
+              <w:rPr>
+                <w:lang w:val="it-IT"/>
+              </w:rPr>
+              <w:t>3</w:t>
+            </w:r>
+          </w:p>
+        </w:tc>
+        <w:tc>
+          <w:tcPr>
+            <w:tcW w:w="6120" w:type="dxa"/>
+            <w:gridSpan w:val="2"/>
+            <w:tcBorders>
+              <w:start w:val="single" w:sz="4" w:space="0" w:color="000000"/>
+              <w:bottom w:val="single" w:sz="4" w:space="0" w:color="000000"/>
+              <w:end w:val="single" w:sz="4" w:space="0" w:color="000000"/>
+            </w:tcBorders>
+          </w:tcPr>
+          <w:p>
+            <w:pPr>
+              <w:pStyle w:val="Normal"/>
+              <w:spacing w:before="0" w:after="160"/>
+              <w:rPr>
+                <w:lang w:val="en-US"/>
+              </w:rPr>
+            </w:pPr>
+            <w:r>
+              <w:rPr>
+                <w:lang w:val="en-US"/>
+              </w:rPr>
+              <w:t>If the user selects a station, initiate UC13 for that station</w:t>
+            </w:r>
+          </w:p>
+        </w:tc>
+      </w:tr>
+      <w:tr>
+        <w:trPr>
+          <w:cantSplit w:val="true"/>
+        </w:trPr>
+        <w:tc>
+          <w:tcPr>
+            <w:tcW w:w="2627" w:type="dxa"/>
+            <w:vMerge w:val="restart"/>
+            <w:tcBorders>
+              <w:top w:val="single" w:sz="4" w:space="0" w:color="000000"/>
+              <w:start w:val="single" w:sz="4" w:space="0" w:color="000000"/>
+              <w:bottom w:val="single" w:sz="4" w:space="0" w:color="000000"/>
+              <w:end w:val="single" w:sz="4" w:space="0" w:color="000000"/>
+            </w:tcBorders>
+          </w:tcPr>
+          <w:p>
+            <w:pPr>
+              <w:pStyle w:val="Normal"/>
+              <w:spacing w:before="0" w:after="160"/>
+              <w:rPr>
+                <w:b/>
+                <w:bCs/>
+                <w:lang w:val="it-IT"/>
+              </w:rPr>
+            </w:pPr>
+            <w:r>
+              <w:rPr>
+                <w:b/>
+                <w:bCs/>
+                <w:lang w:val="it-IT"/>
+              </w:rPr>
+              <w:t>Extension</w:t>
+            </w:r>
+          </w:p>
+        </w:tc>
+        <w:tc>
+          <w:tcPr>
+            <w:tcW w:w="1078" w:type="dxa"/>
+            <w:tcBorders>
+              <w:top w:val="single" w:sz="4" w:space="0" w:color="000000"/>
+              <w:start w:val="single" w:sz="4" w:space="0" w:color="000000"/>
+              <w:bottom w:val="single" w:sz="4" w:space="0" w:color="000000"/>
+              <w:end w:val="single" w:sz="4" w:space="0" w:color="000000"/>
+            </w:tcBorders>
+          </w:tcPr>
+          <w:p>
+            <w:pPr>
+              <w:pStyle w:val="Normal"/>
+              <w:spacing w:before="0" w:after="160"/>
+              <w:rPr>
+                <w:b/>
+                <w:bCs/>
+                <w:lang w:val="en-US"/>
+              </w:rPr>
+            </w:pPr>
+            <w:r>
+              <w:rPr>
+                <w:b/>
+                <w:bCs/>
+                <w:lang w:val="en-US"/>
+              </w:rPr>
+              <w:t>Step</w:t>
+            </w:r>
+          </w:p>
+        </w:tc>
+        <w:tc>
+          <w:tcPr>
+            <w:tcW w:w="6120" w:type="dxa"/>
+            <w:gridSpan w:val="2"/>
+            <w:tcBorders>
+              <w:top w:val="single" w:sz="4" w:space="0" w:color="000000"/>
+              <w:start w:val="single" w:sz="4" w:space="0" w:color="000000"/>
+              <w:bottom w:val="single" w:sz="4" w:space="0" w:color="000000"/>
+              <w:end w:val="single" w:sz="4" w:space="0" w:color="000000"/>
+            </w:tcBorders>
+          </w:tcPr>
+          <w:p>
+            <w:pPr>
+              <w:pStyle w:val="Normal"/>
+              <w:spacing w:before="0" w:after="160"/>
+              <w:rPr>
+                <w:b/>
+                <w:bCs/>
+                <w:lang w:val="en-US"/>
+              </w:rPr>
+            </w:pPr>
+            <w:r>
+              <w:rPr>
+                <w:b/>
+                <w:bCs/>
+                <w:lang w:val="en-US"/>
+              </w:rPr>
+              <w:t>Other action</w:t>
+            </w:r>
+          </w:p>
+        </w:tc>
+      </w:tr>
+      <w:tr>
+        <w:trPr>
+          <w:cantSplit w:val="true"/>
+        </w:trPr>
+        <w:tc>
+          <w:tcPr>
+            <w:tcW w:w="2627" w:type="dxa"/>
+            <w:vMerge w:val="continue"/>
+            <w:tcBorders>
+              <w:top w:val="single" w:sz="4" w:space="0" w:color="000000"/>
+              <w:start w:val="single" w:sz="4" w:space="0" w:color="000000"/>
+              <w:bottom w:val="single" w:sz="4" w:space="0" w:color="000000"/>
+              <w:end w:val="single" w:sz="4" w:space="0" w:color="000000"/>
+            </w:tcBorders>
+            <w:vAlign w:val="center"/>
+          </w:tcPr>
+          <w:p>
+            <w:pPr>
+              <w:pStyle w:val="Normal"/>
+              <w:spacing w:before="0" w:after="160"/>
+              <w:rPr>
+                <w:b/>
+                <w:bCs/>
+                <w:lang w:val="it-IT"/>
+              </w:rPr>
+            </w:pPr>
+            <w:r>
+              <w:rPr>
+                <w:b/>
+                <w:bCs/>
+                <w:lang w:val="it-IT"/>
+              </w:rPr>
+            </w:r>
+          </w:p>
+        </w:tc>
+        <w:tc>
+          <w:tcPr>
+            <w:tcW w:w="1078" w:type="dxa"/>
+            <w:tcBorders>
+              <w:top w:val="single" w:sz="4" w:space="0" w:color="000000"/>
+              <w:start w:val="single" w:sz="4" w:space="0" w:color="000000"/>
+              <w:bottom w:val="single" w:sz="4" w:space="0" w:color="000000"/>
+              <w:end w:val="single" w:sz="4" w:space="0" w:color="000000"/>
+            </w:tcBorders>
+          </w:tcPr>
+          <w:p>
+            <w:pPr>
+              <w:pStyle w:val="Normal"/>
+              <w:spacing w:before="0" w:after="160"/>
+              <w:rPr>
+                <w:lang w:val="it-IT"/>
+              </w:rPr>
+            </w:pPr>
+            <w:r>
+              <w:rPr>
+                <w:lang w:val="it-IT"/>
+              </w:rPr>
+              <w:t>4a</w:t>
+            </w:r>
+          </w:p>
+        </w:tc>
+        <w:tc>
+          <w:tcPr>
+            <w:tcW w:w="6120" w:type="dxa"/>
+            <w:gridSpan w:val="2"/>
+            <w:tcBorders>
+              <w:top w:val="single" w:sz="4" w:space="0" w:color="000000"/>
+              <w:start w:val="single" w:sz="4" w:space="0" w:color="000000"/>
+              <w:bottom w:val="single" w:sz="4" w:space="0" w:color="000000"/>
+              <w:end w:val="single" w:sz="4" w:space="0" w:color="000000"/>
+            </w:tcBorders>
+          </w:tcPr>
+          <w:p>
+            <w:pPr>
+              <w:pStyle w:val="Normal"/>
+              <w:spacing w:before="0" w:after="160"/>
+              <w:rPr>
+                <w:lang w:val="en-US"/>
+              </w:rPr>
+            </w:pPr>
+            <w:r>
+              <w:rPr>
+                <w:lang w:val="en-US"/>
+              </w:rPr>
+              <w:t>If no identifier matches the string, prodice “No match” error and return to step 2</w:t>
+            </w:r>
+          </w:p>
+        </w:tc>
+      </w:tr>
+      <w:tr>
+        <w:trPr/>
+        <w:tc>
+          <w:tcPr>
+            <w:tcW w:w="2627" w:type="dxa"/>
+            <w:tcBorders>
+              <w:top w:val="single" w:sz="4" w:space="0" w:color="000000"/>
+              <w:start w:val="single" w:sz="4" w:space="0" w:color="000000"/>
+              <w:bottom w:val="single" w:sz="4" w:space="0" w:color="000000"/>
+              <w:end w:val="single" w:sz="4" w:space="0" w:color="000000"/>
+            </w:tcBorders>
+          </w:tcPr>
+          <w:p>
+            <w:pPr>
+              <w:pStyle w:val="Normal"/>
+              <w:spacing w:before="0" w:after="160"/>
+              <w:rPr>
+                <w:b/>
+                <w:bCs/>
+                <w:lang w:val="it-IT"/>
+              </w:rPr>
+            </w:pPr>
+            <w:r>
+              <w:rPr>
+                <w:b/>
+                <w:bCs/>
+                <w:lang w:val="it-IT"/>
+              </w:rPr>
+              <w:t>Technology &amp; data Variations</w:t>
+            </w:r>
+          </w:p>
+        </w:tc>
+        <w:tc>
+          <w:tcPr>
+            <w:tcW w:w="7198" w:type="dxa"/>
+            <w:gridSpan w:val="3"/>
+            <w:tcBorders>
+              <w:top w:val="single" w:sz="4" w:space="0" w:color="000000"/>
+              <w:start w:val="single" w:sz="4" w:space="0" w:color="000000"/>
+              <w:bottom w:val="single" w:sz="4" w:space="0" w:color="000000"/>
+              <w:end w:val="single" w:sz="4" w:space="0" w:color="000000"/>
+            </w:tcBorders>
+          </w:tcPr>
+          <w:p>
+            <w:pPr>
+              <w:pStyle w:val="Normal"/>
+              <w:spacing w:before="0" w:after="160"/>
+              <w:rPr>
+                <w:lang w:val="en-US"/>
+              </w:rPr>
+            </w:pPr>
+            <w:r>
+              <w:rPr>
+                <w:lang w:val="en-US"/>
+              </w:rPr>
+              <w:t>None</w:t>
+            </w:r>
+          </w:p>
+        </w:tc>
+      </w:tr>
+    </w:tbl>
+    <w:p>
+      <w:pPr>
+        <w:pStyle w:val="Normal"/>
+        <w:spacing w:before="0" w:after="160"/>
+        <w:rPr/>
+      </w:pPr>
       <w:r>
         <w:rPr/>
       </w:r>

</xml_diff>